<commit_message>
docs: add team Q&A, update architecture doc, ignore Office temp files
- Add supportive-docs/answers.md with full answers to all 6 team questions
- Add supportive-docs/Team questions.docx (source document)
- Update Architecture Design Document: replace stale prototype-era sentences
  (sections 10 & 11) that contradicted the fully-implemented system —
  Kafka KRaft, Notification Service, and all 6 service paths are now live
- Add ~$* pattern to .gitignore to exclude Microsoft Office lock files

Co-Authored-By: Claude Sonnet 4.6 <noreply@anthropic.com>
</commit_message>
<xml_diff>
--- a/deliverable-docs/Architecture Design Document.docx
+++ b/deliverable-docs/Architecture Design Document.docx
@@ -2625,7 +2625,7 @@
         <w:rPr>
           <w:i/>
         </w:rPr>
-        <w:t>Note: The prototype (Prototype) implements Student Service and Exam Service only. The remaining six services are designed in this document but noted as "designed, not implemented" in the prototype submission.</w:t>
+        <w:t>Note: All six services (Auth, Student, Exam, Result, Transcript, Notification) are fully implemented and running. Apache Kafka 3.7 (KRaft mode) is deployed as a seventh container, with the Notification Service consuming all domain events.</w:t>
       </w:r>
     </w:p>
     <w:p>
@@ -2641,7 +2641,8 @@
         <w:pStyle w:val="ListBullet"/>
       </w:pPr>
       <w:r>
-        <w:t>The prototype is scoped to two services (Student, Exam) as per the assignment brief for solo work.</w:t>
+        <w:rPr/>
+        <w:t>All six services are fully implemented and deployed via Docker Compose, covering auth, student management, exam workflows, result processing, transcript generation, and event-driven notifications.</w:t>
       </w:r>
     </w:p>
     <w:p>
@@ -2649,7 +2650,8 @@
         <w:pStyle w:val="ListBullet"/>
       </w:pPr>
       <w:r>
-        <w:t>Kafka is included in the design but not wired in the prototype — events are noted in code comments.</w:t>
+        <w:rPr/>
+        <w:t>Kafka is implemented using Apache Kafka 3.7 in KRaft mode (no Zookeeper). The Notification Service (port 3006) consumes three Kafka topics (student.created, exam.registered, result.published) and persists each event as a NotificationLog record in MongoDB.</w:t>
       </w:r>
     </w:p>
     <w:p>
@@ -2673,7 +2675,8 @@
         <w:pStyle w:val="ListBullet"/>
       </w:pPr>
       <w:r>
-        <w:t>NGINX configuration for the full eight services is defined in design but only Student and Exam paths are active in the prototype.</w:t>
+        <w:rPr/>
+        <w:t>NGINX reverse proxy routes all six active services. All service paths (/api/auth, /api/students, /api/exams, /api/results, /api/transcripts, /api/notifications) are active and proxied to their respective containers.</w:t>
       </w:r>
     </w:p>
     <w:p>

</xml_diff>

<commit_message>
docs: update Architecture Design Document with manual edits
Co-Authored-By: Claude Sonnet 4.6 <noreply@anthropic.com>
</commit_message>
<xml_diff>
--- a/deliverable-docs/Architecture Design Document.docx
+++ b/deliverable-docs/Architecture Design Document.docx
@@ -123,7 +123,6 @@
     </w:p>
     <w:p>
       <w:r>
-        <w:rPr/>
         <w:t>All eight services are described below. See the Service Identification Table for the full Service Identification Table.</w:t>
       </w:r>
     </w:p>
@@ -487,6 +486,7 @@
         <w:pStyle w:val="ListBullet"/>
       </w:pPr>
       <w:r>
+        <w:lastRenderedPageBreak/>
         <w:t>GET /api/courses</w:t>
       </w:r>
     </w:p>
@@ -495,7 +495,6 @@
         <w:pStyle w:val="ListBullet"/>
       </w:pPr>
       <w:r>
-        <w:lastRenderedPageBreak/>
         <w:t>GET /api/courses/:id</w:t>
       </w:r>
     </w:p>
@@ -844,7 +843,11 @@
           </w:tcPr>
           <w:p>
             <w:r>
-              <w:t>Generates PDF transcripts using pdfkit. Consumes result.published Kafka events to update its local snapshot of student grades. Fetches full result data from Result Service via REST when generating a transcript on demand.</w:t>
+              <w:t xml:space="preserve">Generates PDF transcripts using pdfkit. Consumes result.published Kafka events to update its local snapshot of student grades. Fetches full result data from Result Service </w:t>
+            </w:r>
+            <w:r>
+              <w:lastRenderedPageBreak/>
+              <w:t>via REST when generating a transcript on demand.</w:t>
             </w:r>
           </w:p>
         </w:tc>
@@ -1184,11 +1187,11 @@
           </w:tcPr>
           <w:p>
             <w:r>
-              <w:t xml:space="preserve">A single language across all services eliminates context-switching. Express is minimal and well-understood, with a large ecosystem. Node's non-blocking I/O suits the service pattern of handling </w:t>
+              <w:t>A single language across all services eliminates context-switching. Express is minimal and well-understood, with a large ecosystem. Node's non-</w:t>
             </w:r>
             <w:r>
               <w:lastRenderedPageBreak/>
-              <w:t>many concurrent HTTP or Kafka messages.</w:t>
+              <w:t>blocking I/O suits the service pattern of handling many concurrent HTTP or Kafka messages.</w:t>
             </w:r>
           </w:p>
         </w:tc>
@@ -1221,7 +1224,6 @@
           </w:tcPr>
           <w:p>
             <w:r>
-              <w:rPr/>
               <w:t>MongoDB's document model suits the varied schemas of university data (student profiles, exam entries, PDF metadata). Mongoose provides schema validation at the application layer while retaining flexibility. See Section 6 (Database Strategy) for the database strategy justification.</w:t>
             </w:r>
           </w:p>
@@ -1382,11 +1384,11 @@
           </w:tcPr>
           <w:p>
             <w:r>
-              <w:t xml:space="preserve">Each service has a Dockerfile using node:20-alpine for minimal image size. docker-compose wires </w:t>
+              <w:t xml:space="preserve">Each service has a </w:t>
             </w:r>
             <w:r>
               <w:lastRenderedPageBreak/>
-              <w:t>services, databases, and networking with one command, matching the architecture's service isolation in local development.</w:t>
+              <w:t>Dockerfile using node:20-alpine for minimal image size. docker-compose wires services, databases, and networking with one command, matching the architecture's service isolation in local development.</w:t>
             </w:r>
           </w:p>
         </w:tc>
@@ -1398,7 +1400,6 @@
         <w:pStyle w:val="Heading1"/>
       </w:pPr>
       <w:r>
-        <w:rPr/>
         <w:t>6. Database Strategy — Database-per-Service</w:t>
       </w:r>
     </w:p>
@@ -1753,6 +1754,9 @@
         </w:tc>
       </w:tr>
       <w:tr>
+        <w:trPr>
+          <w:trHeight w:val="417"/>
+        </w:trPr>
         <w:tc>
           <w:tcPr>
             <w:tcW w:w="2880" w:type="dxa"/>
@@ -1790,9 +1794,14 @@
       <w:pPr>
         <w:pStyle w:val="Heading2"/>
       </w:pPr>
+      <w:proofErr w:type="gramStart"/>
       <w:r>
         <w:lastRenderedPageBreak/>
-        <w:t>6.4  MongoDB Justification</w:t>
+        <w:t>6.4  MongoDB</w:t>
+      </w:r>
+      <w:proofErr w:type="gramEnd"/>
+      <w:r>
+        <w:t xml:space="preserve"> Justification</w:t>
       </w:r>
     </w:p>
     <w:p>
@@ -2558,11 +2567,15 @@
         <w:t>Tokens expire after a configurable period (default: 24 hours). bcrypt is used for password hashing in the Auth Service with a work factor of 12.</w:t>
       </w:r>
     </w:p>
+    <w:p/>
+    <w:p/>
+    <w:p/>
     <w:p>
       <w:pPr>
         <w:pStyle w:val="Heading1"/>
       </w:pPr>
       <w:r>
+        <w:lastRenderedPageBreak/>
         <w:t>10. Deployment Overview</w:t>
       </w:r>
     </w:p>
@@ -2592,7 +2605,6 @@
         <w:pStyle w:val="ListBullet"/>
       </w:pPr>
       <w:r>
-        <w:lastRenderedPageBreak/>
         <w:t>mongo-students — MongoDB 7, isolated volume (students-data)</w:t>
       </w:r>
     </w:p>
@@ -2625,7 +2637,7 @@
         <w:rPr>
           <w:i/>
         </w:rPr>
-        <w:t>Note: All six services (Auth, Student, Exam, Result, Transcript, Notification) are fully implemented and running. Apache Kafka 3.7 (KRaft mode) is deployed as a seventh container, with the Notification Service consuming all domain events.</w:t>
+        <w:t>Note: The prototype (Prototype) implements Student Service and Exam Service only. The remaining six services are designed in this document but noted as "designed, not implemented" in the prototype submission.</w:t>
       </w:r>
     </w:p>
     <w:p>
@@ -2641,8 +2653,7 @@
         <w:pStyle w:val="ListBullet"/>
       </w:pPr>
       <w:r>
-        <w:rPr/>
-        <w:t>All six services are fully implemented and deployed via Docker Compose, covering auth, student management, exam workflows, result processing, transcript generation, and event-driven notifications.</w:t>
+        <w:t>The prototype is scoped to two services (Student, Exam) as per the assignment brief for solo work.</w:t>
       </w:r>
     </w:p>
     <w:p>
@@ -2650,8 +2661,7 @@
         <w:pStyle w:val="ListBullet"/>
       </w:pPr>
       <w:r>
-        <w:rPr/>
-        <w:t>Kafka is implemented using Apache Kafka 3.7 in KRaft mode (no Zookeeper). The Notification Service (port 3006) consumes three Kafka topics (student.created, exam.registered, result.published) and persists each event as a NotificationLog record in MongoDB.</w:t>
+        <w:t>Kafka is included in the design but not wired in the prototype — events are noted in code comments.</w:t>
       </w:r>
     </w:p>
     <w:p>
@@ -2675,8 +2685,7 @@
         <w:pStyle w:val="ListBullet"/>
       </w:pPr>
       <w:r>
-        <w:rPr/>
-        <w:t>NGINX reverse proxy routes all six active services. All service paths (/api/auth, /api/students, /api/exams, /api/results, /api/transcripts, /api/notifications) are active and proxied to their respective containers.</w:t>
+        <w:t>NGINX configuration for the full eight services is defined in design but only Student and Exam paths are active in the prototype.</w:t>
       </w:r>
     </w:p>
     <w:p>
@@ -2690,7 +2699,6 @@
     <w:p/>
     <w:p>
       <w:r>
-        <w:rPr/>
         <w:t>References: Service Identification Table, Bounded Context Diagram, API Endpoint Design, Service Communication Diagram, Benefits &amp; Risks.</w:t>
       </w:r>
     </w:p>

</xml_diff>

<commit_message>
docs: insert architecture diagram image into Architecture Design Document
Embeds the component-level diagram (from architecture-diagram.drawio) into the document per the pending pre-submission checklist item.

Co-Authored-By: Claude Sonnet 5 <noreply@anthropic.com>
</commit_message>
<xml_diff>
--- a/deliverable-docs/Architecture Design Document.docx
+++ b/deliverable-docs/Architecture Design Document.docx
@@ -114,10 +114,77 @@
     </w:p>
     <w:p>
       <w:pPr>
-        <w:pStyle w:val="Heading1"/>
+        <w:pStyle w:val="ListBullet"/>
+        <w:numPr>
+          <w:ilvl w:val="0"/>
+          <w:numId w:val="0"/>
+        </w:numPr>
+        <w:ind w:left="360" w:hanging="360"/>
+      </w:pPr>
+    </w:p>
+    <w:p>
+      <w:pPr>
+        <w:pStyle w:val="ListBullet"/>
+        <w:numPr>
+          <w:ilvl w:val="0"/>
+          <w:numId w:val="0"/>
+        </w:numPr>
+        <w:ind w:left="360" w:hanging="360"/>
+      </w:pPr>
+    </w:p>
+    <w:p>
+      <w:pPr>
+        <w:pStyle w:val="ListBullet"/>
+        <w:numPr>
+          <w:ilvl w:val="0"/>
+          <w:numId w:val="0"/>
+        </w:numPr>
+        <w:ind w:left="360" w:hanging="360"/>
       </w:pPr>
       <w:r>
         <w:lastRenderedPageBreak/>
+        <w:drawing>
+          <wp:inline distT="0" distB="0" distL="0" distR="0" wp14:anchorId="06DAA0D0" wp14:editId="27CCE899">
+            <wp:extent cx="5486400" cy="5408295"/>
+            <wp:effectExtent l="0" t="0" r="0" b="1905"/>
+            <wp:docPr id="48809111" name="Picture 1"/>
+            <wp:cNvGraphicFramePr>
+              <a:graphicFrameLocks xmlns:a="http://schemas.openxmlformats.org/drawingml/2006/main" noChangeAspect="1"/>
+            </wp:cNvGraphicFramePr>
+            <a:graphic xmlns:a="http://schemas.openxmlformats.org/drawingml/2006/main">
+              <a:graphicData uri="http://schemas.openxmlformats.org/drawingml/2006/picture">
+                <pic:pic xmlns:pic="http://schemas.openxmlformats.org/drawingml/2006/picture">
+                  <pic:nvPicPr>
+                    <pic:cNvPr id="48809111" name=""/>
+                    <pic:cNvPicPr/>
+                  </pic:nvPicPr>
+                  <pic:blipFill>
+                    <a:blip r:embed="rId6"/>
+                    <a:stretch>
+                      <a:fillRect/>
+                    </a:stretch>
+                  </pic:blipFill>
+                  <pic:spPr>
+                    <a:xfrm>
+                      <a:off x="0" y="0"/>
+                      <a:ext cx="5486400" cy="5408295"/>
+                    </a:xfrm>
+                    <a:prstGeom prst="rect">
+                      <a:avLst/>
+                    </a:prstGeom>
+                  </pic:spPr>
+                </pic:pic>
+              </a:graphicData>
+            </a:graphic>
+          </wp:inline>
+        </w:drawing>
+      </w:r>
+    </w:p>
+    <w:p>
+      <w:pPr>
+        <w:pStyle w:val="Heading1"/>
+      </w:pPr>
+      <w:r>
         <w:t>4. Service Catalogue</w:t>
       </w:r>
     </w:p>
@@ -222,6 +289,7 @@
     </w:tbl>
     <w:p>
       <w:r>
+        <w:lastRenderedPageBreak/>
         <w:t>Key endpoints:</w:t>
       </w:r>
     </w:p>
@@ -486,7 +554,6 @@
         <w:pStyle w:val="ListBullet"/>
       </w:pPr>
       <w:r>
-        <w:lastRenderedPageBreak/>
         <w:t>GET /api/courses</w:t>
       </w:r>
     </w:p>
@@ -587,7 +654,11 @@
           </w:tcPr>
           <w:p>
             <w:r>
-              <w:t>Creates exams and manages student exam entries. Before creating an entry, it verifies the student exists by calling GET /api/students/:id on the Student Service (synchronous REST). Publishes exam.registered to Kafka on successful enrolment.</w:t>
+              <w:t xml:space="preserve">Creates exams and manages student exam entries. Before creating an entry, it verifies the student exists by calling GET /api/students/:id on the Student Service (synchronous REST). Publishes exam.registered to Kafka on successful </w:t>
+            </w:r>
+            <w:r>
+              <w:lastRenderedPageBreak/>
+              <w:t>enrolment.</w:t>
             </w:r>
           </w:p>
         </w:tc>
@@ -595,6 +666,7 @@
     </w:tbl>
     <w:p>
       <w:r>
+        <w:lastRenderedPageBreak/>
         <w:t>Key endpoints:</w:t>
       </w:r>
     </w:p>
@@ -843,11 +915,7 @@
           </w:tcPr>
           <w:p>
             <w:r>
-              <w:t xml:space="preserve">Generates PDF transcripts using pdfkit. Consumes result.published Kafka events to update its local snapshot of student grades. Fetches full result data from Result Service </w:t>
-            </w:r>
-            <w:r>
-              <w:lastRenderedPageBreak/>
-              <w:t>via REST when generating a transcript on demand.</w:t>
+              <w:t>Generates PDF transcripts using pdfkit. Consumes result.published Kafka events to update its local snapshot of student grades. Fetches full result data from Result Service via REST when generating a transcript on demand.</w:t>
             </w:r>
           </w:p>
         </w:tc>
@@ -855,7 +923,6 @@
     </w:tbl>
     <w:p>
       <w:r>
-        <w:lastRenderedPageBreak/>
         <w:t>Key endpoints:</w:t>
       </w:r>
     </w:p>
@@ -964,7 +1031,11 @@
           </w:tcPr>
           <w:p>
             <w:r>
-              <w:t>Kafka consumer that sends email or SMS notifications on three events: student.created, exam.registered, and result.published. Logs all sent notifications to notif_db for audit.</w:t>
+              <w:t xml:space="preserve">Kafka consumer that sends email or SMS notifications on three events: </w:t>
+            </w:r>
+            <w:r>
+              <w:lastRenderedPageBreak/>
+              <w:t>student.created, exam.registered, and result.published. Logs all sent notifications to notif_db for audit.</w:t>
             </w:r>
           </w:p>
         </w:tc>
@@ -972,6 +1043,7 @@
     </w:tbl>
     <w:p>
       <w:r>
+        <w:lastRenderedPageBreak/>
         <w:t>Key endpoints:</w:t>
       </w:r>
     </w:p>
@@ -1187,11 +1259,7 @@
           </w:tcPr>
           <w:p>
             <w:r>
-              <w:t>A single language across all services eliminates context-switching. Express is minimal and well-understood, with a large ecosystem. Node's non-</w:t>
-            </w:r>
-            <w:r>
-              <w:lastRenderedPageBreak/>
-              <w:t>blocking I/O suits the service pattern of handling many concurrent HTTP or Kafka messages.</w:t>
+              <w:t>A single language across all services eliminates context-switching. Express is minimal and well-understood, with a large ecosystem. Node's non-blocking I/O suits the service pattern of handling many concurrent HTTP or Kafka messages.</w:t>
             </w:r>
           </w:p>
         </w:tc>
@@ -1203,28 +1271,31 @@
           </w:tcPr>
           <w:p>
             <w:r>
+              <w:t>MongoDB + Mongoose ODM</w:t>
+            </w:r>
+          </w:p>
+        </w:tc>
+        <w:tc>
+          <w:tcPr>
+            <w:tcW w:w="2880" w:type="dxa"/>
+          </w:tcPr>
+          <w:p>
+            <w:r>
+              <w:t>All Services (one DB each)</w:t>
+            </w:r>
+          </w:p>
+        </w:tc>
+        <w:tc>
+          <w:tcPr>
+            <w:tcW w:w="2880" w:type="dxa"/>
+          </w:tcPr>
+          <w:p>
+            <w:r>
+              <w:t xml:space="preserve">MongoDB's document model suits the varied schemas of university data (student profiles, exam entries, PDF metadata). Mongoose provides schema validation at the application layer while retaining flexibility. See Section 6 (Database Strategy) for the </w:t>
+            </w:r>
+            <w:r>
               <w:lastRenderedPageBreak/>
-              <w:t>MongoDB + Mongoose ODM</w:t>
-            </w:r>
-          </w:p>
-        </w:tc>
-        <w:tc>
-          <w:tcPr>
-            <w:tcW w:w="2880" w:type="dxa"/>
-          </w:tcPr>
-          <w:p>
-            <w:r>
-              <w:t>All Services (one DB each)</w:t>
-            </w:r>
-          </w:p>
-        </w:tc>
-        <w:tc>
-          <w:tcPr>
-            <w:tcW w:w="2880" w:type="dxa"/>
-          </w:tcPr>
-          <w:p>
-            <w:r>
-              <w:t>MongoDB's document model suits the varied schemas of university data (student profiles, exam entries, PDF metadata). Mongoose provides schema validation at the application layer while retaining flexibility. See Section 6 (Database Strategy) for the database strategy justification.</w:t>
+              <w:t>database strategy justification.</w:t>
             </w:r>
           </w:p>
         </w:tc>
@@ -1236,6 +1307,7 @@
           </w:tcPr>
           <w:p>
             <w:r>
+              <w:lastRenderedPageBreak/>
               <w:t>NGINX Reverse Proxy</w:t>
             </w:r>
           </w:p>
@@ -1384,11 +1456,7 @@
           </w:tcPr>
           <w:p>
             <w:r>
-              <w:t xml:space="preserve">Each service has a </w:t>
-            </w:r>
-            <w:r>
-              <w:lastRenderedPageBreak/>
-              <w:t>Dockerfile using node:20-alpine for minimal image size. docker-compose wires services, databases, and networking with one command, matching the architecture's service isolation in local development.</w:t>
+              <w:t>Each service has a Dockerfile using node:20-alpine for minimal image size. docker-compose wires services, databases, and networking with one command, matching the architecture's service isolation in local development.</w:t>
             </w:r>
           </w:p>
         </w:tc>
@@ -1400,6 +1468,7 @@
         <w:pStyle w:val="Heading1"/>
       </w:pPr>
       <w:r>
+        <w:lastRenderedPageBreak/>
         <w:t>6. Database Strategy — Database-per-Service</w:t>
       </w:r>
     </w:p>
@@ -1794,12 +1863,9 @@
       <w:pPr>
         <w:pStyle w:val="Heading2"/>
       </w:pPr>
-      <w:proofErr w:type="gramStart"/>
       <w:r>
-        <w:lastRenderedPageBreak/>
-        <w:t>6.4  MongoDB</w:t>
+        <w:t>6.4 MongoDB</w:t>
       </w:r>
-      <w:proofErr w:type="gramEnd"/>
       <w:r>
         <w:t xml:space="preserve"> Justification</w:t>
       </w:r>
@@ -1830,6 +1896,7 @@
         <w:pStyle w:val="ListBullet"/>
       </w:pPr>
       <w:r>
+        <w:lastRenderedPageBreak/>
         <w:t>Single cluster, isolated databases: a MongoDB cluster natively supports multiple databases, enabling the database-per-service pattern without provisioning separate database servers.</w:t>
       </w:r>
     </w:p>
@@ -2053,7 +2120,6 @@
               <w:rPr>
                 <w:b/>
               </w:rPr>
-              <w:lastRenderedPageBreak/>
               <w:t>Event</w:t>
             </w:r>
           </w:p>
@@ -2231,6 +2297,7 @@
         <w:pStyle w:val="Heading1"/>
       </w:pPr>
       <w:r>
+        <w:lastRenderedPageBreak/>
         <w:t>8. NGINX Reverse Proxy Routing</w:t>
       </w:r>
     </w:p>
@@ -2575,7 +2642,6 @@
         <w:pStyle w:val="Heading1"/>
       </w:pPr>
       <w:r>
-        <w:lastRenderedPageBreak/>
         <w:t>10. Deployment Overview</w:t>
       </w:r>
     </w:p>
@@ -2637,6 +2703,7 @@
         <w:rPr>
           <w:i/>
         </w:rPr>
+        <w:lastRenderedPageBreak/>
         <w:t>Note: The prototype (Prototype) implements Student Service and Exam Service only. The remaining six services are designed in this document but noted as "designed, not implemented" in the prototype submission.</w:t>
       </w:r>
     </w:p>

</xml_diff>